<commit_message>
add credibility post to twitter thread — GA, M&A track record
</commit_message>
<xml_diff>
--- a/pyre-twitter-thread.docx
+++ b/pyre-twitter-thread.docx
@@ -192,7 +192,7 @@
           <w:b/>
           <w:bCs/>
         </w:rPr>
-        <w:t xml:space="preserve">Post 4/4</w:t>
+        <w:t xml:space="preserve">Post 4/5</w:t>
       </w:r>
     </w:p>
     <w:p>
@@ -208,7 +208,7 @@
         <w:pStyle w:val="BodyText"/>
       </w:pPr>
       <w:r>
-        <w:t xml:space="preserve">We build custom AI agents and run private LLM infrastructure for businesses — Mac Studios for small shops, tinyboxes for mid size, on-site servers and AWS for enterprise. Your data stays yours.</w:t>
+        <w:t xml:space="preserve">We build custom AI agents and private LLM infrastructure for businesses. Mac Studios for small shops, tinyboxes for mid size, on-site servers and AWS for enterprise. Your data never leaves your walls.</w:t>
       </w:r>
     </w:p>
     <w:p>
@@ -220,11 +220,54 @@
       </w:r>
     </w:p>
     <w:p>
+      <w:r>
+        <w:pict>
+          <v:rect style="width:0;height:1.5pt" o:hralign="center" o:hrstd="t" o:hr="t"/>
+        </w:pict>
+      </w:r>
+    </w:p>
+    <w:p>
+      <w:pPr>
+        <w:pStyle w:val="FirstParagraph"/>
+      </w:pPr>
+      <w:r>
+        <w:rPr>
+          <w:b/>
+          <w:bCs/>
+        </w:rPr>
+        <w:t xml:space="preserve">Post 5/5</w:t>
+      </w:r>
+    </w:p>
+    <w:p>
       <w:pPr>
         <w:pStyle w:val="BodyText"/>
       </w:pPr>
       <w:r>
-        <w:t xml:space="preserve">cruz@phoenixstrategy.group if you want to talk AI.</w:t>
+        <w:t xml:space="preserve">PSG isn’t just an AI shop. We’re operators. 240+ portfolio companies, $200M+ raised, 100+ M&amp;A deals closed.</w:t>
+      </w:r>
+    </w:p>
+    <w:p>
+      <w:pPr>
+        <w:pStyle w:val="BodyText"/>
+      </w:pPr>
+      <w:r>
+        <w:t xml:space="preserve">Our team helped take General Assembly from startup to $413M acquisition. Commissions Inc — $45M exit, then flipped again for $220M. Fractional CFO to 80+ companies backed by Accel and Sequoia.</w:t>
+      </w:r>
+    </w:p>
+    <w:p>
+      <w:pPr>
+        <w:pStyle w:val="BodyText"/>
+      </w:pPr>
+      <w:r>
+        <w:t xml:space="preserve">Finance, data, AI, M&amp;A — all one team. If any of that’s useful, hit me up.</w:t>
+      </w:r>
+    </w:p>
+    <w:p>
+      <w:pPr>
+        <w:pStyle w:val="BodyText"/>
+      </w:pPr>
+      <w:r>
+        <w:t xml:space="preserve">cruz@phoenixstrategy.group</w:t>
       </w:r>
     </w:p>
     <w:p>

</xml_diff>